<commit_message>
tool to restore false positive odt/docx changes
</commit_message>
<xml_diff>
--- a/example/result/e02_paragraphs.docx
+++ b/example/result/e02_paragraphs.docx
@@ -4,7 +4,7 @@
   <w:body>
     <w:p>
       <w:r>
-        <w:t>With start_paragraph we can start a paragraph.</w:t>
+        <w:t>With new_paragraph we can start a paragraph.</w:t>
       </w:r>
       <w:r>
         <w:t xml:space="preserve"> With add_text we can add text to the paragraph.</w:t>
@@ -15,7 +15,7 @@
     </w:p>
     <w:p>
       <w:r>
-        <w:t>With start_paragraph we can start a second paragraph.</w:t>
+        <w:t>With new_paragraph we can start a second paragraph.</w:t>
       </w:r>
       <w:r>
         <w:t xml:space="preserve"> With add_text we can add text to the second</w:t>

</xml_diff>